<commit_message>
Fix IEEE table-caption order and compact Fig. 1 for two-column layout.
Move TABLE I–V titles above each table and shorten the pipeline figure
so Table I is no longer split across columns.

Co-authored-by: Ductam6767 <Ductam6767@users.noreply.github.com>
</commit_message>
<xml_diff>
--- a/reports/AIRPATH_AI_JIGS_EDIT.docx
+++ b/reports/AIRPATH_AI_JIGS_EDIT.docx
@@ -220,7 +220,7 @@
       <w:r>
         <w:drawing>
           <wp:inline xmlns:a="http://schemas.openxmlformats.org/drawingml/2006/main" xmlns:pic="http://schemas.openxmlformats.org/drawingml/2006/picture">
-            <wp:extent cx="2971800" cy="5989320"/>
+            <wp:extent cx="2971800" cy="4069080"/>
             <wp:docPr id="1" name="Picture 1"/>
             <wp:cNvGraphicFramePr>
               <a:graphicFrameLocks noChangeAspect="1"/>
@@ -241,7 +241,7 @@
                   <pic:spPr>
                     <a:xfrm>
                       <a:off x="0" y="0"/>
-                      <a:ext cx="2971800" cy="5989320"/>
+                      <a:ext cx="2971800" cy="4069080"/>
                     </a:xfrm>
                     <a:prstGeom prst="rect"/>
                   </pic:spPr>
@@ -275,6 +275,14 @@
       </w:pPr>
       <w:r>
         <w:t>The HealthyAir dataset contains 52,548 station-level records from six stations, covering 23 February 2021 21:00 to 21 June 2022 17:00. Rakholia et al. [2] describe minute collection; the file analyzed here is hourly. Variables include PM2.5, TSP, O3, CO, NO2, SO2, temperature, and humidity. PM2.5 has 0% missingness. Secondary variables have substantial missingness, and 207 PM2.5 observations equal zero, 205 of them at Station 5. IQR-flagged PM2.5 observations were not automatically deleted. The dataset is split chronologically into training, validation, and test sets.</w:t>
+      </w:r>
+    </w:p>
+    <w:p>
+      <w:pPr>
+        <w:pStyle w:val="IEEECaption"/>
+      </w:pPr>
+      <w:r>
+        <w:t>TABLE I. Summary of the HealthyAir HCMC dataset.</w:t>
       </w:r>
     </w:p>
     <w:tbl>
@@ -656,14 +664,6 @@
     </w:tbl>
     <w:p>
       <w:pPr>
-        <w:pStyle w:val="IEEECaption"/>
-      </w:pPr>
-      <w:r>
-        <w:t>TABLE I. Summary of the HealthyAir HCMC dataset.</w:t>
-      </w:r>
-    </w:p>
-    <w:p>
-      <w:pPr>
         <w:pStyle w:val="IEEEHead2"/>
       </w:pPr>
       <w:r>
@@ -677,6 +677,14 @@
       </w:pPr>
       <w:r>
         <w:t>Persistence predicts y_hat(t+h) = PM2.5(t). XGBoost V1 uses PM2.5 lags t−1, t−2, and t−3 together with time and station features. Current-PM XGBoost adds PM2.5(t), removing the feature mismatch in the initial comparison. Validation is used for model selection; the test set is not used for post-locking tuning. Current-PM XGBoost is fixed for downstream analysis because it has lower RMSE and higher R² than persistence at each reported horizon, although persistence has lower MAE.</w:t>
+      </w:r>
+    </w:p>
+    <w:p>
+      <w:pPr>
+        <w:pStyle w:val="IEEECaption"/>
+      </w:pPr>
+      <w:r>
+        <w:t>TABLE II. Validation MAE / RMSE / R² for Persistence and Current-PM XGBoost (+1 h, +2 h, and +3 h).</w:t>
       </w:r>
     </w:p>
     <w:tbl>
@@ -935,14 +943,6 @@
     </w:tbl>
     <w:p>
       <w:pPr>
-        <w:pStyle w:val="IEEECaption"/>
-      </w:pPr>
-      <w:r>
-        <w:t>TABLE II. Validation MAE / RMSE / R² for Persistence and Current-PM XGBoost (+1 h, +2 h, and +3 h).</w:t>
-      </w:r>
-    </w:p>
-    <w:p>
-      <w:pPr>
         <w:spacing w:before="0" w:after="0"/>
       </w:pPr>
       <w:r>
@@ -964,6 +964,14 @@
       </w:pPr>
       <w:r>
         <w:t>Nearest station, IDW p = 1, and IDW p = 2 are compared using leave-one-station-out development evaluation. IDW p = 1 provides the best pooled result and is fixed for downstream use. Reliability diagnostics include nearest-station distance, second-nearest distance, contributing-station count, and IDW weight concentration. These diagnostics are not calibrated uncertainty intervals.</w:t>
+      </w:r>
+    </w:p>
+    <w:p>
+      <w:pPr>
+        <w:pStyle w:val="IEEECaption"/>
+      </w:pPr>
+      <w:r>
+        <w:t>TABLE III. Development evaluation of spatial estimation methods.</w:t>
       </w:r>
     </w:p>
     <w:tbl>
@@ -1255,14 +1263,6 @@
     </w:tbl>
     <w:p>
       <w:pPr>
-        <w:pStyle w:val="IEEECaption"/>
-      </w:pPr>
-      <w:r>
-        <w:t>TABLE III. Development evaluation of spatial estimation methods.</w:t>
-      </w:r>
-    </w:p>
-    <w:p>
-      <w:pPr>
         <w:pStyle w:val="IEEEHead2"/>
       </w:pPr>
       <w:r>
@@ -1395,6 +1395,14 @@
       </w:pPr>
       <w:r>
         <w:t>P0-2B holds the same 30 OD pairs and changes the observation clock on 2022-02-27: 06:00, 08:00, 12:00, 17:00, and 20:00. This is a limited date/time robustness check against diurnal confounding, not a multi-week calendar sample. 2022-02-27 is used because 2022-02-28 lacks complete Station-4 +1/+2/+3 h tables. This produces 30 × 2 × 5 × 5 = 1,500 nontrivial cases (δ &gt; 0). Spearman correlation is 0.997. The selected route changes in 20/1,500 cases, or 1.33% (Wilson 95% CI 0.86–2.05%). These 20 changes arise from four OD × mode × departure-time cells, each differing at all five positive δ values (4 × 5 = 20). At 12:00, 17:00, and 20:00, no route change is observed, even though midday |ΔE| can be large (about 17%) without reselection. The mean oracle improvement when the selected route differs is approximately 0.02%.</w:t>
+      </w:r>
+    </w:p>
+    <w:p>
+      <w:pPr>
+        <w:pStyle w:val="IEEECaption"/>
+      </w:pPr>
+      <w:r>
+        <w:t>TABLE IV. Gap 1 temporal-assignment comparison; all counts exclude δ = 0, which leaves only the fastest route.</w:t>
       </w:r>
     </w:p>
     <w:tbl>
@@ -1683,14 +1691,6 @@
     </w:tbl>
     <w:p>
       <w:pPr>
-        <w:pStyle w:val="IEEECaption"/>
-      </w:pPr>
-      <w:r>
-        <w:t>TABLE IV. Gap 1 temporal-assignment comparison; all counts exclude δ = 0, which leaves only the fastest route.</w:t>
-      </w:r>
-    </w:p>
-    <w:p>
-      <w:pPr>
         <w:pStyle w:val="IEEEHead2"/>
       </w:pPr>
       <w:r>
@@ -1721,6 +1721,14 @@
       </w:pPr>
       <w:r>
         <w:t>Gap 2 addresses a different question: when a user accepts an absolute additional-time budget, how often does the feasible set contain a route that is both slower and lower-exposure than the fastest route? The audit uses 30 OD pairs, two modes, five departure times, and five positive budgets, yielding 1,500 cases.</w:t>
+      </w:r>
+    </w:p>
+    <w:p>
+      <w:pPr>
+        <w:pStyle w:val="IEEECaption"/>
+      </w:pPr>
+      <w:r>
+        <w:t>TABLE V. Gap 2 exhaustive trade-off audit.</w:t>
       </w:r>
     </w:p>
     <w:tbl>
@@ -1880,14 +1888,6 @@
         </w:tc>
       </w:tr>
     </w:tbl>
-    <w:p>
-      <w:pPr>
-        <w:pStyle w:val="IEEECaption"/>
-      </w:pPr>
-      <w:r>
-        <w:t>TABLE V. Gap 2 exhaustive trade-off audit.</w:t>
-      </w:r>
-    </w:p>
     <w:p>
       <w:pPr>
         <w:pStyle w:val="IEEEBody"/>

</xml_diff>

<commit_message>
Insert a sharp full-width Fig. 2 from the live web screenshot.
Upscale and re-embed the evening-peak UI capture at 4200px so the
PDF no longer shows the downsampled blurry LibreOffice JPEG.

Co-authored-by: Ductam6767 <Ductam6767@users.noreply.github.com>
</commit_message>
<xml_diff>
--- a/reports/AIRPATH_AI_JIGS_EDIT.docx
+++ b/reports/AIRPATH_AI_JIGS_EDIT.docx
@@ -1960,13 +1960,21 @@
     </w:p>
     <w:p>
       <w:pPr>
+        <w:spacing w:before="0" w:after="0"/>
+      </w:pPr>
+      <w:r>
+        <w:br w:type="page"/>
+      </w:r>
+    </w:p>
+    <w:p>
+      <w:pPr>
         <w:spacing w:before="40" w:after="20"/>
         <w:jc w:val="center"/>
       </w:pPr>
       <w:r>
         <w:drawing>
           <wp:inline xmlns:a="http://schemas.openxmlformats.org/drawingml/2006/main" xmlns:pic="http://schemas.openxmlformats.org/drawingml/2006/picture">
-            <wp:extent cx="2971800" cy="1352169"/>
+            <wp:extent cx="6400800" cy="3680164"/>
             <wp:docPr id="2" name="Picture 2"/>
             <wp:cNvGraphicFramePr>
               <a:graphicFrameLocks noChangeAspect="1"/>
@@ -1975,7 +1983,7 @@
               <a:graphicData uri="http://schemas.openxmlformats.org/drawingml/2006/picture">
                 <pic:pic>
                   <pic:nvPicPr>
-                    <pic:cNvPr id="0" name="image2.png"/>
+                    <pic:cNvPr id="0" name="image2.jpeg"/>
                     <pic:cNvPicPr/>
                   </pic:nvPicPr>
                   <pic:blipFill>
@@ -1987,7 +1995,7 @@
                   <pic:spPr>
                     <a:xfrm>
                       <a:off x="0" y="0"/>
-                      <a:ext cx="2971800" cy="1352169"/>
+                      <a:ext cx="6400800" cy="3680164"/>
                     </a:xfrm>
                     <a:prstGeom prst="rect"/>
                   </pic:spPr>
@@ -2003,7 +2011,7 @@
         <w:pStyle w:val="IEEECaption"/>
       </w:pPr>
       <w:r>
-        <w:t>Fig. 2. AIRPATH-AI web prototype screenshot (motorbike, evening-peak demo window) for Hẻm Cao Thắng · Hòa Hưng to Khu phố 11 · Phú Lâm. The three-session control is a demo congestion proxy only; it is not Gap 1 or Gap 2.</w:t>
+        <w:t>Fig. 2. AIRPATH-AI web prototype (motorbike, evening-peak demo window, +5 min): Hẻm Cao Thắng · Hòa Hưng to Khu phố 11 · Phú Lâm. High-resolution interface screenshot; the three-session control is a demo congestion proxy only (not Gap 1 or Gap 2).</w:t>
       </w:r>
     </w:p>
     <w:p>

</xml_diff>

<commit_message>
Replace Fig. 2 with a crisp local UI screenshot (no map watermark).
Switch the demo map tiles from Carto to OSM so manuscript and live UI
screenshots stay readable, then re-embed the evening-peak Cao Thắng →
Phú Lâm capture into the JIGS docx/PDF copies at full resolution.

Co-authored-by: Ductam6767 <Ductam6767@users.noreply.github.com>
</commit_message>
<xml_diff>
--- a/reports/AIRPATH_AI_JIGS_EDIT.docx
+++ b/reports/AIRPATH_AI_JIGS_EDIT.docx
@@ -1974,7 +1974,7 @@
       <w:r>
         <w:drawing>
           <wp:inline xmlns:a="http://schemas.openxmlformats.org/drawingml/2006/main" xmlns:pic="http://schemas.openxmlformats.org/drawingml/2006/picture">
-            <wp:extent cx="6400800" cy="3680164"/>
+            <wp:extent cx="6400800" cy="4000500"/>
             <wp:docPr id="2" name="Picture 2"/>
             <wp:cNvGraphicFramePr>
               <a:graphicFrameLocks noChangeAspect="1"/>
@@ -1995,7 +1995,7 @@
                   <pic:spPr>
                     <a:xfrm>
                       <a:off x="0" y="0"/>
-                      <a:ext cx="6400800" cy="3680164"/>
+                      <a:ext cx="6400800" cy="4000500"/>
                     </a:xfrm>
                     <a:prstGeom prst="rect"/>
                   </pic:spPr>

</xml_diff>

<commit_message>
Fix remaining old-manuscript issues: gas subscripts, authors, affiliation.
Apply teacher markup still open in the prior FINAL_REVISED PDF: O3/NO2/SO2
as proper Word subscripts, ASCII author names with superscripts, and a
single Ho Chi Minh City in the affiliation line. Table captions, Horizon
header, Fig. 2 screenshot, and time-of-day demo disclaimer were already
correct in the revised draft.

Co-authored-by: Ductam6767 <Ductam6767@users.noreply.github.com>
</commit_message>
<xml_diff>
--- a/reports/AIRPATH_AI_JIGS_EDIT.docx
+++ b/reports/AIRPATH_AI_JIGS_EDIT.docx
@@ -26,7 +26,7 @@
           <w:rFonts w:ascii="Times New Roman" w:hAnsi="Times New Roman"/>
           <w:sz w:val="23"/>
         </w:rPr>
-        <w:t>Lê Minh Đức and Trần Dương Minh Tâm</w:t>
+        <w:t>Le Minh Duc¹ and Tran Duong Minh Tam¹</w:t>
       </w:r>
     </w:p>
     <w:p>
@@ -39,7 +39,7 @@
           <w:rFonts w:ascii="Times New Roman" w:hAnsi="Times New Roman"/>
           <w:sz w:val="19"/>
         </w:rPr>
-        <w:t>High School for the Gifted, Vietnam National University Ho Chi Minh City, Ho Chi Minh City, Vietnam</w:t>
+        <w:t>¹High School for the Gifted, Vietnam National University, Ho Chi Minh City, Vietnam</w:t>
       </w:r>
     </w:p>
     <w:p>
@@ -274,7 +274,37 @@
         <w:ind w:firstLine="216"/>
       </w:pPr>
       <w:r>
-        <w:t>The HealthyAir dataset contains 52,548 station-level records from six stations, covering 23 February 2021 21:00 to 21 June 2022 17:00. Rakholia et al. [2] describe minute collection; the file analyzed here is hourly. Variables include PM2.5, TSP, O3, CO, NO2, SO2, temperature, and humidity. PM2.5 has 0% missingness. Secondary variables have substantial missingness, and 207 PM2.5 observations equal zero, 205 of them at Station 5. IQR-flagged PM2.5 observations were not automatically deleted. The dataset is split chronologically into training, validation, and test sets.</w:t>
+        <w:t>The HealthyAir dataset contains 52,548 station-level records from six stations, covering 23 February 2021 21:00 to 21 June 2022 17:00. Rakholia et al. [2] describe minute collection; the file analyzed here is hourly. Variables include PM2.5, TSP, O</w:t>
+      </w:r>
+      <w:r>
+        <w:rPr>
+          <w:vertAlign w:val="subscript"/>
+        </w:rPr>
+        <w:t>3</w:t>
+      </w:r>
+      <w:r>
+        <w:rPr/>
+        <w:t>, CO, NO</w:t>
+      </w:r>
+      <w:r>
+        <w:rPr>
+          <w:vertAlign w:val="subscript"/>
+        </w:rPr>
+        <w:t>2</w:t>
+      </w:r>
+      <w:r>
+        <w:rPr/>
+        <w:t>, SO</w:t>
+      </w:r>
+      <w:r>
+        <w:rPr>
+          <w:vertAlign w:val="subscript"/>
+        </w:rPr>
+        <w:t>2</w:t>
+      </w:r>
+      <w:r>
+        <w:rPr/>
+        <w:t>, temperature, and humidity. PM2.5 has 0% missingness. Secondary variables have substantial missingness, and 207 PM2.5 observations equal zero, 205 of them at Station 5. IQR-flagged PM2.5 observations were not automatically deleted. The dataset is split chronologically into training, validation, and test sets.</w:t>
       </w:r>
     </w:p>
     <w:p>

</xml_diff>